<commit_message>
Italian Part 2: episodes 18-20; keep « Scandicci » among the 12 model names (ep17)
Co-Authored-By: Claude Opus 5.5 <noreply@anthropic.com>
Claude-Session: https://claude.ai/code/session_014Pwa4fJotSRvNewqVrvk7U
</commit_message>
<xml_diff>
--- a/business_it/part2/ep17_Il_servizio_fotografico.docx
+++ b/business_it/part2/ep17_Il_servizio_fotografico.docx
@@ -3234,7 +3234,7 @@
           <w:sz w:val="22"/>
         </w:rPr>
         <w:tab/>
-        <w:t>« Greve », « Mosciano », « Giogoli », « Torri », « Ponte », « Olmo » e « Lastra ». Fiumi, frazioni e strade qui intorno.</w:t>
+        <w:t>« Greve », « Mosciano », « Giogoli », « Torri », « Ponte » e « Olmo »: fiumi, frazioni e strade qui intorno. E la borsa a spalla resta « Scandicci », come l'ha sempre chiamata il babbo.</w:t>
       </w:r>
     </w:p>
     <w:p>
@@ -10771,7 +10771,7 @@
           <w:sz w:val="21"/>
         </w:rPr>
         <w:tab/>
-        <w:t>'그레베', '모시아노', '조골리', '토리', '폰테', '올모', 그리고 '라스트라'. 이 근처 강, 마을, 길 이름들이야.</w:t>
+        <w:t>'그레베', '모시아노', '조골리', '토리', '폰테', '올모'. 이 근처 강, 마을, 길 이름이야. 그리고 숄더백은 아빠가 늘 부르던 대로 '스칸디치'로 남겨 둬.</w:t>
       </w:r>
     </w:p>
     <w:p>

</xml_diff>